<commit_message>
hacer el filtrado pero con la base de datos
</commit_message>
<xml_diff>
--- a/Documentación Proyecto.docx
+++ b/Documentación Proyecto.docx
@@ -7,6 +7,9 @@
         <w:pStyle w:val="Ttulo1"/>
       </w:pPr>
       <w:r>
+        <w:t xml:space="preserve"> </w:t>
+      </w:r>
+      <w:r>
         <w:t>Salas</w:t>
       </w:r>
     </w:p>
@@ -66,11 +69,19 @@
           <w:lang w:val="en-GB"/>
         </w:rPr>
       </w:pPr>
-      <w:r>
-        <w:rPr>
-          <w:lang w:val="en-GB"/>
-        </w:rPr>
-        <w:t>Activity(Lista)</w:t>
+      <w:proofErr w:type="gramStart"/>
+      <w:r>
+        <w:rPr>
+          <w:lang w:val="en-GB"/>
+        </w:rPr>
+        <w:t>Activity(</w:t>
+      </w:r>
+      <w:proofErr w:type="gramEnd"/>
+      <w:r>
+        <w:rPr>
+          <w:lang w:val="en-GB"/>
+        </w:rPr>
+        <w:t>Lista)</w:t>
       </w:r>
     </w:p>
     <w:p>
@@ -105,12 +116,22 @@
           <w:numId w:val="1"/>
         </w:numPr>
       </w:pPr>
-      <w:r>
-        <w:t>Boton Añadir Nueva.</w:t>
+      <w:proofErr w:type="spellStart"/>
+      <w:r>
+        <w:t>Boton</w:t>
+      </w:r>
+      <w:proofErr w:type="spellEnd"/>
+      <w:r>
+        <w:t xml:space="preserve"> Añadir </w:t>
+      </w:r>
+      <w:proofErr w:type="gramStart"/>
+      <w:r>
+        <w:t>Nueva.</w:t>
       </w:r>
       <w:r>
         <w:t>☑</w:t>
       </w:r>
+      <w:proofErr w:type="gramEnd"/>
     </w:p>
     <w:p>
       <w:pPr>
@@ -121,7 +142,15 @@
         </w:numPr>
       </w:pPr>
       <w:r>
-        <w:t>Que pase el código de la sala al Activity_Info_Sala.</w:t>
+        <w:t xml:space="preserve">Que pase el código de la sala al </w:t>
+      </w:r>
+      <w:proofErr w:type="spellStart"/>
+      <w:r>
+        <w:t>Activity_Info_Sala</w:t>
+      </w:r>
+      <w:proofErr w:type="spellEnd"/>
+      <w:r>
+        <w:t>.</w:t>
       </w:r>
       <w:r>
         <w:rPr>
@@ -139,7 +168,15 @@
         </w:numPr>
       </w:pPr>
       <w:r>
-        <w:t>Al pulsar en la lista que vaya a la Activity_Info_Sala.</w:t>
+        <w:t xml:space="preserve">Al pulsar en la lista que vaya a la </w:t>
+      </w:r>
+      <w:proofErr w:type="spellStart"/>
+      <w:r>
+        <w:t>Activity_Info_Sala</w:t>
+      </w:r>
+      <w:proofErr w:type="spellEnd"/>
+      <w:r>
+        <w:t>.</w:t>
       </w:r>
       <w:r>
         <w:rPr>
@@ -155,11 +192,41 @@
           <w:lang w:val="en-GB"/>
         </w:rPr>
       </w:pPr>
-      <w:r>
-        <w:rPr>
-          <w:lang w:val="en-GB"/>
-        </w:rPr>
-        <w:t>Activity_Info(Ficha)</w:t>
+      <w:proofErr w:type="spellStart"/>
+      <w:r>
+        <w:rPr>
+          <w:lang w:val="en-GB"/>
+        </w:rPr>
+        <w:t>Activity_</w:t>
+      </w:r>
+      <w:proofErr w:type="gramStart"/>
+      <w:r>
+        <w:rPr>
+          <w:lang w:val="en-GB"/>
+        </w:rPr>
+        <w:t>Info</w:t>
+      </w:r>
+      <w:proofErr w:type="spellEnd"/>
+      <w:r>
+        <w:rPr>
+          <w:lang w:val="en-GB"/>
+        </w:rPr>
+        <w:t>(</w:t>
+      </w:r>
+      <w:proofErr w:type="spellStart"/>
+      <w:proofErr w:type="gramEnd"/>
+      <w:r>
+        <w:rPr>
+          <w:lang w:val="en-GB"/>
+        </w:rPr>
+        <w:t>Ficha</w:t>
+      </w:r>
+      <w:proofErr w:type="spellEnd"/>
+      <w:r>
+        <w:rPr>
+          <w:lang w:val="en-GB"/>
+        </w:rPr>
+        <w:t>)</w:t>
       </w:r>
       <w:r>
         <w:rPr>
@@ -180,7 +247,15 @@
         <w:t xml:space="preserve">Modificación de los datos </w:t>
       </w:r>
       <w:r>
-        <w:t>de los editText.</w:t>
+        <w:t xml:space="preserve">de los </w:t>
+      </w:r>
+      <w:proofErr w:type="spellStart"/>
+      <w:r>
+        <w:t>editText</w:t>
+      </w:r>
+      <w:proofErr w:type="spellEnd"/>
+      <w:r>
+        <w:t>.</w:t>
       </w:r>
       <w:r>
         <w:rPr>
@@ -284,11 +359,19 @@
           <w:lang w:val="en-GB"/>
         </w:rPr>
       </w:pPr>
-      <w:r>
-        <w:rPr>
-          <w:lang w:val="en-GB"/>
-        </w:rPr>
-        <w:t>Activity(Lista)</w:t>
+      <w:proofErr w:type="gramStart"/>
+      <w:r>
+        <w:rPr>
+          <w:lang w:val="en-GB"/>
+        </w:rPr>
+        <w:t>Activity(</w:t>
+      </w:r>
+      <w:proofErr w:type="gramEnd"/>
+      <w:r>
+        <w:rPr>
+          <w:lang w:val="en-GB"/>
+        </w:rPr>
+        <w:t>Lista)</w:t>
       </w:r>
     </w:p>
     <w:p>
@@ -317,8 +400,13 @@
           <w:numId w:val="1"/>
         </w:numPr>
       </w:pPr>
-      <w:r>
-        <w:t>Boton Añadir Nueva.</w:t>
+      <w:proofErr w:type="spellStart"/>
+      <w:r>
+        <w:t>Boton</w:t>
+      </w:r>
+      <w:proofErr w:type="spellEnd"/>
+      <w:r>
+        <w:t xml:space="preserve"> Añadir Nueva.</w:t>
       </w:r>
       <w:r>
         <w:rPr>
@@ -336,7 +424,15 @@
         </w:numPr>
       </w:pPr>
       <w:r>
-        <w:t>Que pase el código de la sala al Activity_Info_Tipo.</w:t>
+        <w:t xml:space="preserve">Que pase el código de la sala al </w:t>
+      </w:r>
+      <w:proofErr w:type="spellStart"/>
+      <w:r>
+        <w:t>Activity_Info_Tipo</w:t>
+      </w:r>
+      <w:proofErr w:type="spellEnd"/>
+      <w:r>
+        <w:t>.</w:t>
       </w:r>
       <w:r>
         <w:rPr>
@@ -354,7 +450,15 @@
         </w:numPr>
       </w:pPr>
       <w:r>
-        <w:t>Al pulsar en la lista que vaya a la Activity_Info_</w:t>
+        <w:t xml:space="preserve">Al pulsar en la lista que vaya a la </w:t>
+      </w:r>
+      <w:proofErr w:type="spellStart"/>
+      <w:r>
+        <w:t>Activity_Info</w:t>
+      </w:r>
+      <w:proofErr w:type="spellEnd"/>
+      <w:r>
+        <w:t>_</w:t>
       </w:r>
       <w:r>
         <w:t xml:space="preserve"> </w:t>
@@ -376,11 +480,41 @@
           <w:lang w:val="en-GB"/>
         </w:rPr>
       </w:pPr>
-      <w:r>
-        <w:rPr>
-          <w:lang w:val="en-GB"/>
-        </w:rPr>
-        <w:t>Activity_Info(Ficha)</w:t>
+      <w:proofErr w:type="spellStart"/>
+      <w:r>
+        <w:rPr>
+          <w:lang w:val="en-GB"/>
+        </w:rPr>
+        <w:t>Activity_</w:t>
+      </w:r>
+      <w:proofErr w:type="gramStart"/>
+      <w:r>
+        <w:rPr>
+          <w:lang w:val="en-GB"/>
+        </w:rPr>
+        <w:t>Info</w:t>
+      </w:r>
+      <w:proofErr w:type="spellEnd"/>
+      <w:r>
+        <w:rPr>
+          <w:lang w:val="en-GB"/>
+        </w:rPr>
+        <w:t>(</w:t>
+      </w:r>
+      <w:proofErr w:type="spellStart"/>
+      <w:proofErr w:type="gramEnd"/>
+      <w:r>
+        <w:rPr>
+          <w:lang w:val="en-GB"/>
+        </w:rPr>
+        <w:t>Ficha</w:t>
+      </w:r>
+      <w:proofErr w:type="spellEnd"/>
+      <w:r>
+        <w:rPr>
+          <w:lang w:val="en-GB"/>
+        </w:rPr>
+        <w:t>)</w:t>
       </w:r>
       <w:r>
         <w:rPr>
@@ -398,7 +532,15 @@
         </w:numPr>
       </w:pPr>
       <w:r>
-        <w:t>Modificación de los datos de los editText.</w:t>
+        <w:t xml:space="preserve">Modificación de los datos de los </w:t>
+      </w:r>
+      <w:proofErr w:type="spellStart"/>
+      <w:r>
+        <w:t>editText</w:t>
+      </w:r>
+      <w:proofErr w:type="spellEnd"/>
+      <w:r>
+        <w:t>.</w:t>
       </w:r>
       <w:r>
         <w:rPr>
@@ -508,11 +650,19 @@
           <w:lang w:val="en-GB"/>
         </w:rPr>
       </w:pPr>
-      <w:r>
-        <w:rPr>
-          <w:lang w:val="en-GB"/>
-        </w:rPr>
-        <w:t>Activity(Lista)</w:t>
+      <w:proofErr w:type="gramStart"/>
+      <w:r>
+        <w:rPr>
+          <w:lang w:val="en-GB"/>
+        </w:rPr>
+        <w:t>Activity(</w:t>
+      </w:r>
+      <w:proofErr w:type="gramEnd"/>
+      <w:r>
+        <w:rPr>
+          <w:lang w:val="en-GB"/>
+        </w:rPr>
+        <w:t>Lista)</w:t>
       </w:r>
     </w:p>
     <w:p>
@@ -541,8 +691,13 @@
           <w:numId w:val="1"/>
         </w:numPr>
       </w:pPr>
-      <w:r>
-        <w:t>Boton Añadir Nueva.</w:t>
+      <w:proofErr w:type="spellStart"/>
+      <w:r>
+        <w:t>Boton</w:t>
+      </w:r>
+      <w:proofErr w:type="spellEnd"/>
+      <w:r>
+        <w:t xml:space="preserve"> Añadir Nueva.</w:t>
       </w:r>
       <w:r>
         <w:rPr>
@@ -560,7 +715,23 @@
         </w:numPr>
       </w:pPr>
       <w:r>
-        <w:t>Que pase el código del prestamo al Activity_Info_Prestamo.</w:t>
+        <w:t xml:space="preserve">Que pase el código del </w:t>
+      </w:r>
+      <w:proofErr w:type="spellStart"/>
+      <w:r>
+        <w:t>prestamo</w:t>
+      </w:r>
+      <w:proofErr w:type="spellEnd"/>
+      <w:r>
+        <w:t xml:space="preserve"> al </w:t>
+      </w:r>
+      <w:proofErr w:type="spellStart"/>
+      <w:r>
+        <w:t>Activity_Info_Prestamo</w:t>
+      </w:r>
+      <w:proofErr w:type="spellEnd"/>
+      <w:r>
+        <w:t>.</w:t>
       </w:r>
       <w:r>
         <w:rPr>
@@ -578,13 +749,26 @@
         </w:numPr>
       </w:pPr>
       <w:r>
-        <w:t>Al pulsar en la lista que vaya a la Activity_Info_</w:t>
+        <w:t xml:space="preserve">Al pulsar en la lista que vaya a la </w:t>
+      </w:r>
+      <w:proofErr w:type="spellStart"/>
+      <w:r>
+        <w:t>Activity_Info</w:t>
+      </w:r>
+      <w:proofErr w:type="spellEnd"/>
+      <w:r>
+        <w:t>_</w:t>
       </w:r>
       <w:r>
         <w:t xml:space="preserve"> </w:t>
       </w:r>
-      <w:r>
-        <w:t>Prestamo.</w:t>
+      <w:proofErr w:type="spellStart"/>
+      <w:r>
+        <w:t>Prestamo</w:t>
+      </w:r>
+      <w:proofErr w:type="spellEnd"/>
+      <w:r>
+        <w:t>.</w:t>
       </w:r>
       <w:r>
         <w:rPr>
@@ -600,11 +784,41 @@
           <w:lang w:val="en-GB"/>
         </w:rPr>
       </w:pPr>
-      <w:r>
-        <w:rPr>
-          <w:lang w:val="en-GB"/>
-        </w:rPr>
-        <w:t>Activity_Info(Ficha)</w:t>
+      <w:proofErr w:type="spellStart"/>
+      <w:r>
+        <w:rPr>
+          <w:lang w:val="en-GB"/>
+        </w:rPr>
+        <w:t>Activity_</w:t>
+      </w:r>
+      <w:proofErr w:type="gramStart"/>
+      <w:r>
+        <w:rPr>
+          <w:lang w:val="en-GB"/>
+        </w:rPr>
+        <w:t>Info</w:t>
+      </w:r>
+      <w:proofErr w:type="spellEnd"/>
+      <w:r>
+        <w:rPr>
+          <w:lang w:val="en-GB"/>
+        </w:rPr>
+        <w:t>(</w:t>
+      </w:r>
+      <w:proofErr w:type="spellStart"/>
+      <w:proofErr w:type="gramEnd"/>
+      <w:r>
+        <w:rPr>
+          <w:lang w:val="en-GB"/>
+        </w:rPr>
+        <w:t>Ficha</w:t>
+      </w:r>
+      <w:proofErr w:type="spellEnd"/>
+      <w:r>
+        <w:rPr>
+          <w:lang w:val="en-GB"/>
+        </w:rPr>
+        <w:t>)</w:t>
       </w:r>
       <w:r>
         <w:rPr>
@@ -622,7 +836,15 @@
         </w:numPr>
       </w:pPr>
       <w:r>
-        <w:t>Modificación de los datos de los editText.</w:t>
+        <w:t xml:space="preserve">Modificación de los datos de los </w:t>
+      </w:r>
+      <w:proofErr w:type="spellStart"/>
+      <w:r>
+        <w:t>editText</w:t>
+      </w:r>
+      <w:proofErr w:type="spellEnd"/>
+      <w:r>
+        <w:t>.</w:t>
       </w:r>
       <w:r>
         <w:rPr>
@@ -640,8 +862,13 @@
         </w:numPr>
       </w:pPr>
       <w:r>
-        <w:t>Ocultar los campos del código cuando sea un nuevo Prestamo</w:t>
-      </w:r>
+        <w:t xml:space="preserve">Ocultar los campos del código cuando sea un nuevo </w:t>
+      </w:r>
+      <w:proofErr w:type="spellStart"/>
+      <w:r>
+        <w:t>Prestamo</w:t>
+      </w:r>
+      <w:proofErr w:type="spellEnd"/>
       <w:r>
         <w:t xml:space="preserve">. </w:t>
       </w:r>
@@ -660,9 +887,11 @@
           <w:numId w:val="3"/>
         </w:numPr>
       </w:pPr>
+      <w:proofErr w:type="spellStart"/>
       <w:r>
         <w:t>DatePickers</w:t>
       </w:r>
+      <w:proofErr w:type="spellEnd"/>
       <w:r>
         <w:t xml:space="preserve">. </w:t>
       </w:r>
@@ -700,7 +929,15 @@
         </w:numPr>
       </w:pPr>
       <w:r>
-        <w:t>Mostrar Spinner Usuarios.</w:t>
+        <w:t xml:space="preserve">Mostrar </w:t>
+      </w:r>
+      <w:proofErr w:type="spellStart"/>
+      <w:r>
+        <w:t>Spinner</w:t>
+      </w:r>
+      <w:proofErr w:type="spellEnd"/>
+      <w:r>
+        <w:t xml:space="preserve"> Usuarios.</w:t>
       </w:r>
       <w:r>
         <w:rPr>
@@ -718,7 +955,15 @@
         </w:numPr>
       </w:pPr>
       <w:r>
-        <w:t>Mostrar Spinner Elementos.</w:t>
+        <w:t xml:space="preserve">Mostrar </w:t>
+      </w:r>
+      <w:proofErr w:type="spellStart"/>
+      <w:r>
+        <w:t>Spinner</w:t>
+      </w:r>
+      <w:proofErr w:type="spellEnd"/>
+      <w:r>
+        <w:t xml:space="preserve"> Elementos.</w:t>
       </w:r>
       <w:r>
         <w:rPr>
@@ -736,7 +981,15 @@
         </w:numPr>
       </w:pPr>
       <w:r>
-        <w:t>Guardar Spinner Usuarios.</w:t>
+        <w:t xml:space="preserve">Guardar </w:t>
+      </w:r>
+      <w:proofErr w:type="spellStart"/>
+      <w:r>
+        <w:t>Spinner</w:t>
+      </w:r>
+      <w:proofErr w:type="spellEnd"/>
+      <w:r>
+        <w:t xml:space="preserve"> Usuarios.</w:t>
       </w:r>
       <w:r>
         <w:rPr>
@@ -754,7 +1007,15 @@
         </w:numPr>
       </w:pPr>
       <w:r>
-        <w:t>Guardar Spinner Elementos.</w:t>
+        <w:t xml:space="preserve">Guardar </w:t>
+      </w:r>
+      <w:proofErr w:type="spellStart"/>
+      <w:r>
+        <w:t>Spinner</w:t>
+      </w:r>
+      <w:proofErr w:type="spellEnd"/>
+      <w:r>
+        <w:t xml:space="preserve"> Elementos.</w:t>
       </w:r>
       <w:r>
         <w:rPr>
@@ -774,9 +1035,11 @@
       <w:r>
         <w:t xml:space="preserve">Guardar un </w:t>
       </w:r>
+      <w:proofErr w:type="spellStart"/>
       <w:r>
         <w:t>Prestamo</w:t>
       </w:r>
+      <w:proofErr w:type="spellEnd"/>
       <w:r>
         <w:t>.</w:t>
       </w:r>
@@ -855,11 +1118,19 @@
           <w:lang w:val="en-GB"/>
         </w:rPr>
       </w:pPr>
-      <w:r>
-        <w:rPr>
-          <w:lang w:val="en-GB"/>
-        </w:rPr>
-        <w:t>Activity(Lista)</w:t>
+      <w:proofErr w:type="gramStart"/>
+      <w:r>
+        <w:rPr>
+          <w:lang w:val="en-GB"/>
+        </w:rPr>
+        <w:t>Activity(</w:t>
+      </w:r>
+      <w:proofErr w:type="gramEnd"/>
+      <w:r>
+        <w:rPr>
+          <w:lang w:val="en-GB"/>
+        </w:rPr>
+        <w:t>Lista)</w:t>
       </w:r>
     </w:p>
     <w:p>
@@ -888,8 +1159,13 @@
           <w:numId w:val="1"/>
         </w:numPr>
       </w:pPr>
-      <w:r>
-        <w:t>Boton Añadir Nueva.</w:t>
+      <w:proofErr w:type="spellStart"/>
+      <w:r>
+        <w:t>Boton</w:t>
+      </w:r>
+      <w:proofErr w:type="spellEnd"/>
+      <w:r>
+        <w:t xml:space="preserve"> Añadir Nueva.</w:t>
       </w:r>
       <w:r>
         <w:rPr>
@@ -907,7 +1183,23 @@
         </w:numPr>
       </w:pPr>
       <w:r>
-        <w:t>Que pase el código de la ubicación y  el de la sala al Activity_Info_Ubicación.</w:t>
+        <w:t xml:space="preserve">Que pase el código de la ubicación </w:t>
+      </w:r>
+      <w:proofErr w:type="gramStart"/>
+      <w:r>
+        <w:t>y  el</w:t>
+      </w:r>
+      <w:proofErr w:type="gramEnd"/>
+      <w:r>
+        <w:t xml:space="preserve"> de la sala al </w:t>
+      </w:r>
+      <w:proofErr w:type="spellStart"/>
+      <w:r>
+        <w:t>Activity_Info_Ubicación</w:t>
+      </w:r>
+      <w:proofErr w:type="spellEnd"/>
+      <w:r>
+        <w:t>.</w:t>
       </w:r>
       <w:r>
         <w:rPr>
@@ -925,7 +1217,15 @@
         </w:numPr>
       </w:pPr>
       <w:r>
-        <w:t>Al pulsar en la lista que vaya a la Activity_Info_</w:t>
+        <w:t xml:space="preserve">Al pulsar en la lista que vaya a la </w:t>
+      </w:r>
+      <w:proofErr w:type="spellStart"/>
+      <w:r>
+        <w:t>Activity_Info</w:t>
+      </w:r>
+      <w:proofErr w:type="spellEnd"/>
+      <w:r>
+        <w:t>_</w:t>
       </w:r>
       <w:r>
         <w:t xml:space="preserve"> </w:t>
@@ -947,12 +1247,42 @@
           <w:lang w:val="en-GB"/>
         </w:rPr>
       </w:pPr>
+      <w:proofErr w:type="spellStart"/>
       <w:r>
         <w:rPr>
           <w:lang w:val="en-GB"/>
         </w:rPr>
         <w:lastRenderedPageBreak/>
-        <w:t>Activity_Info(Ficha)</w:t>
+        <w:t>Activity_</w:t>
+      </w:r>
+      <w:proofErr w:type="gramStart"/>
+      <w:r>
+        <w:rPr>
+          <w:lang w:val="en-GB"/>
+        </w:rPr>
+        <w:t>Info</w:t>
+      </w:r>
+      <w:proofErr w:type="spellEnd"/>
+      <w:r>
+        <w:rPr>
+          <w:lang w:val="en-GB"/>
+        </w:rPr>
+        <w:t>(</w:t>
+      </w:r>
+      <w:proofErr w:type="spellStart"/>
+      <w:proofErr w:type="gramEnd"/>
+      <w:r>
+        <w:rPr>
+          <w:lang w:val="en-GB"/>
+        </w:rPr>
+        <w:t>Ficha</w:t>
+      </w:r>
+      <w:proofErr w:type="spellEnd"/>
+      <w:r>
+        <w:rPr>
+          <w:lang w:val="en-GB"/>
+        </w:rPr>
+        <w:t>)</w:t>
       </w:r>
       <w:r>
         <w:rPr>
@@ -970,8 +1300,13 @@
         </w:numPr>
       </w:pPr>
       <w:r>
-        <w:t>Modificación de los datos de los editText</w:t>
-      </w:r>
+        <w:t xml:space="preserve">Modificación de los datos de los </w:t>
+      </w:r>
+      <w:proofErr w:type="spellStart"/>
+      <w:r>
+        <w:t>editText</w:t>
+      </w:r>
+      <w:proofErr w:type="spellEnd"/>
       <w:r>
         <w:t xml:space="preserve">. </w:t>
       </w:r>
@@ -1008,9 +1343,11 @@
           <w:numId w:val="3"/>
         </w:numPr>
       </w:pPr>
+      <w:proofErr w:type="spellStart"/>
       <w:r>
         <w:t>DatePickers</w:t>
       </w:r>
+      <w:proofErr w:type="spellEnd"/>
       <w:r>
         <w:t xml:space="preserve">. </w:t>
       </w:r>
@@ -1048,7 +1385,15 @@
         </w:numPr>
       </w:pPr>
       <w:r>
-        <w:t>Mostrar Spinner Salas.</w:t>
+        <w:t xml:space="preserve">Mostrar </w:t>
+      </w:r>
+      <w:proofErr w:type="spellStart"/>
+      <w:r>
+        <w:t>Spinner</w:t>
+      </w:r>
+      <w:proofErr w:type="spellEnd"/>
+      <w:r>
+        <w:t xml:space="preserve"> Salas.</w:t>
       </w:r>
       <w:r>
         <w:t xml:space="preserve"> </w:t>
@@ -1069,7 +1414,15 @@
         </w:numPr>
       </w:pPr>
       <w:r>
-        <w:t>Mostrar Spinner Elementos.</w:t>
+        <w:t xml:space="preserve">Mostrar </w:t>
+      </w:r>
+      <w:proofErr w:type="spellStart"/>
+      <w:r>
+        <w:t>Spinner</w:t>
+      </w:r>
+      <w:proofErr w:type="spellEnd"/>
+      <w:r>
+        <w:t xml:space="preserve"> Elementos.</w:t>
       </w:r>
       <w:r>
         <w:t xml:space="preserve"> </w:t>
@@ -1090,7 +1443,15 @@
         </w:numPr>
       </w:pPr>
       <w:r>
-        <w:t xml:space="preserve">Guardar Spinner </w:t>
+        <w:t xml:space="preserve">Guardar </w:t>
+      </w:r>
+      <w:proofErr w:type="spellStart"/>
+      <w:r>
+        <w:t>Spinner</w:t>
+      </w:r>
+      <w:proofErr w:type="spellEnd"/>
+      <w:r>
+        <w:t xml:space="preserve"> </w:t>
       </w:r>
       <w:r>
         <w:t>Salas</w:t>
@@ -1114,7 +1475,15 @@
         </w:numPr>
       </w:pPr>
       <w:r>
-        <w:t>Guardar Spinner Elementos.</w:t>
+        <w:t xml:space="preserve">Guardar </w:t>
+      </w:r>
+      <w:proofErr w:type="spellStart"/>
+      <w:r>
+        <w:t>Spinner</w:t>
+      </w:r>
+      <w:proofErr w:type="spellEnd"/>
+      <w:r>
+        <w:t xml:space="preserve"> Elementos.</w:t>
       </w:r>
       <w:r>
         <w:rPr>
@@ -1161,12 +1530,14 @@
           <w:lang w:val="en-GB"/>
         </w:rPr>
       </w:pPr>
+      <w:proofErr w:type="spellStart"/>
       <w:r>
         <w:rPr>
           <w:lang w:val="en-GB"/>
         </w:rPr>
         <w:t>Usuario</w:t>
       </w:r>
+      <w:proofErr w:type="spellEnd"/>
     </w:p>
     <w:p>
       <w:pPr>
@@ -1222,11 +1593,19 @@
           <w:lang w:val="en-GB"/>
         </w:rPr>
       </w:pPr>
-      <w:r>
-        <w:rPr>
-          <w:lang w:val="en-GB"/>
-        </w:rPr>
-        <w:t>Activity(Lista)</w:t>
+      <w:proofErr w:type="gramStart"/>
+      <w:r>
+        <w:rPr>
+          <w:lang w:val="en-GB"/>
+        </w:rPr>
+        <w:t>Activity(</w:t>
+      </w:r>
+      <w:proofErr w:type="gramEnd"/>
+      <w:r>
+        <w:rPr>
+          <w:lang w:val="en-GB"/>
+        </w:rPr>
+        <w:t>Lista)</w:t>
       </w:r>
     </w:p>
     <w:p>
@@ -1255,8 +1634,13 @@
           <w:numId w:val="1"/>
         </w:numPr>
       </w:pPr>
-      <w:r>
-        <w:t>Boton Añadir Nuevo.</w:t>
+      <w:proofErr w:type="spellStart"/>
+      <w:r>
+        <w:t>Boton</w:t>
+      </w:r>
+      <w:proofErr w:type="spellEnd"/>
+      <w:r>
+        <w:t xml:space="preserve"> Añadir Nuevo.</w:t>
       </w:r>
       <w:r>
         <w:rPr>
@@ -1274,7 +1658,15 @@
         </w:numPr>
       </w:pPr>
       <w:r>
-        <w:t>Que pase el código del Usuario y Nombre al Activity_Info_Usuario.</w:t>
+        <w:t xml:space="preserve">Que pase el código del Usuario y Nombre al </w:t>
+      </w:r>
+      <w:proofErr w:type="spellStart"/>
+      <w:r>
+        <w:t>Activity_Info_Usuario</w:t>
+      </w:r>
+      <w:proofErr w:type="spellEnd"/>
+      <w:r>
+        <w:t>.</w:t>
       </w:r>
       <w:r>
         <w:rPr>
@@ -1292,7 +1684,15 @@
         </w:numPr>
       </w:pPr>
       <w:r>
-        <w:t>Al pulsar en la lista que vaya a la Activity_Info_Usuario.</w:t>
+        <w:t xml:space="preserve">Al pulsar en la lista que vaya a la </w:t>
+      </w:r>
+      <w:proofErr w:type="spellStart"/>
+      <w:r>
+        <w:t>Activity_Info_Usuario</w:t>
+      </w:r>
+      <w:proofErr w:type="spellEnd"/>
+      <w:r>
+        <w:t>.</w:t>
       </w:r>
       <w:r>
         <w:rPr>
@@ -1308,11 +1708,41 @@
           <w:lang w:val="en-GB"/>
         </w:rPr>
       </w:pPr>
-      <w:r>
-        <w:rPr>
-          <w:lang w:val="en-GB"/>
-        </w:rPr>
-        <w:t>Activity_Info(Ficha)</w:t>
+      <w:proofErr w:type="spellStart"/>
+      <w:r>
+        <w:rPr>
+          <w:lang w:val="en-GB"/>
+        </w:rPr>
+        <w:t>Activity_</w:t>
+      </w:r>
+      <w:proofErr w:type="gramStart"/>
+      <w:r>
+        <w:rPr>
+          <w:lang w:val="en-GB"/>
+        </w:rPr>
+        <w:t>Info</w:t>
+      </w:r>
+      <w:proofErr w:type="spellEnd"/>
+      <w:r>
+        <w:rPr>
+          <w:lang w:val="en-GB"/>
+        </w:rPr>
+        <w:t>(</w:t>
+      </w:r>
+      <w:proofErr w:type="spellStart"/>
+      <w:proofErr w:type="gramEnd"/>
+      <w:r>
+        <w:rPr>
+          <w:lang w:val="en-GB"/>
+        </w:rPr>
+        <w:t>Ficha</w:t>
+      </w:r>
+      <w:proofErr w:type="spellEnd"/>
+      <w:r>
+        <w:rPr>
+          <w:lang w:val="en-GB"/>
+        </w:rPr>
+        <w:t>)</w:t>
       </w:r>
       <w:r>
         <w:rPr>
@@ -1330,7 +1760,15 @@
         </w:numPr>
       </w:pPr>
       <w:r>
-        <w:t>Modificación de los datos de los editText.</w:t>
+        <w:t xml:space="preserve">Modificación de los datos de los </w:t>
+      </w:r>
+      <w:proofErr w:type="spellStart"/>
+      <w:r>
+        <w:t>editText</w:t>
+      </w:r>
+      <w:proofErr w:type="spellEnd"/>
+      <w:r>
+        <w:t>.</w:t>
       </w:r>
       <w:r>
         <w:rPr>
@@ -1401,12 +1839,14 @@
           <w:lang w:val="en-GB"/>
         </w:rPr>
       </w:pPr>
+      <w:proofErr w:type="spellStart"/>
       <w:r>
         <w:rPr>
           <w:lang w:val="en-GB"/>
         </w:rPr>
         <w:t>Elemento</w:t>
       </w:r>
+      <w:proofErr w:type="spellEnd"/>
     </w:p>
     <w:p>
       <w:pPr>
@@ -1462,12 +1902,20 @@
           <w:lang w:val="en-GB"/>
         </w:rPr>
       </w:pPr>
+      <w:proofErr w:type="gramStart"/>
       <w:r>
         <w:rPr>
           <w:lang w:val="en-GB"/>
         </w:rPr>
         <w:lastRenderedPageBreak/>
-        <w:t>Activity(Lista)</w:t>
+        <w:t>Activity(</w:t>
+      </w:r>
+      <w:proofErr w:type="gramEnd"/>
+      <w:r>
+        <w:rPr>
+          <w:lang w:val="en-GB"/>
+        </w:rPr>
+        <w:t>Lista)</w:t>
       </w:r>
     </w:p>
     <w:p>
@@ -1496,8 +1944,13 @@
           <w:numId w:val="1"/>
         </w:numPr>
       </w:pPr>
-      <w:r>
-        <w:t>Boton Añadir Nuevo.</w:t>
+      <w:proofErr w:type="spellStart"/>
+      <w:r>
+        <w:t>Boton</w:t>
+      </w:r>
+      <w:proofErr w:type="spellEnd"/>
+      <w:r>
+        <w:t xml:space="preserve"> Añadir Nuevo.</w:t>
       </w:r>
       <w:r>
         <w:rPr>
@@ -1515,7 +1968,15 @@
         </w:numPr>
       </w:pPr>
       <w:r>
-        <w:t>Que pase el código del elemento al Activity_Info_Elemento.</w:t>
+        <w:t xml:space="preserve">Que pase el código del elemento al </w:t>
+      </w:r>
+      <w:proofErr w:type="spellStart"/>
+      <w:r>
+        <w:t>Activity_Info_Elemento</w:t>
+      </w:r>
+      <w:proofErr w:type="spellEnd"/>
+      <w:r>
+        <w:t>.</w:t>
       </w:r>
       <w:r>
         <w:rPr>
@@ -1533,7 +1994,15 @@
         </w:numPr>
       </w:pPr>
       <w:r>
-        <w:t>Al pulsar en la lista que vaya a la Activity_Info_</w:t>
+        <w:t xml:space="preserve">Al pulsar en la lista que vaya a la </w:t>
+      </w:r>
+      <w:proofErr w:type="spellStart"/>
+      <w:r>
+        <w:t>Activity_Info</w:t>
+      </w:r>
+      <w:proofErr w:type="spellEnd"/>
+      <w:r>
+        <w:t>_</w:t>
       </w:r>
       <w:r>
         <w:t xml:space="preserve"> </w:t>
@@ -1555,11 +2024,41 @@
           <w:lang w:val="en-GB"/>
         </w:rPr>
       </w:pPr>
-      <w:r>
-        <w:rPr>
-          <w:lang w:val="en-GB"/>
-        </w:rPr>
-        <w:t>Activity_Info(Ficha)</w:t>
+      <w:proofErr w:type="spellStart"/>
+      <w:r>
+        <w:rPr>
+          <w:lang w:val="en-GB"/>
+        </w:rPr>
+        <w:t>Activity_</w:t>
+      </w:r>
+      <w:proofErr w:type="gramStart"/>
+      <w:r>
+        <w:rPr>
+          <w:lang w:val="en-GB"/>
+        </w:rPr>
+        <w:t>Info</w:t>
+      </w:r>
+      <w:proofErr w:type="spellEnd"/>
+      <w:r>
+        <w:rPr>
+          <w:lang w:val="en-GB"/>
+        </w:rPr>
+        <w:t>(</w:t>
+      </w:r>
+      <w:proofErr w:type="spellStart"/>
+      <w:proofErr w:type="gramEnd"/>
+      <w:r>
+        <w:rPr>
+          <w:lang w:val="en-GB"/>
+        </w:rPr>
+        <w:t>Ficha</w:t>
+      </w:r>
+      <w:proofErr w:type="spellEnd"/>
+      <w:r>
+        <w:rPr>
+          <w:lang w:val="en-GB"/>
+        </w:rPr>
+        <w:t>)</w:t>
       </w:r>
       <w:r>
         <w:rPr>
@@ -1577,7 +2076,15 @@
         </w:numPr>
       </w:pPr>
       <w:r>
-        <w:t>Modificación de los datos de los editText.</w:t>
+        <w:t xml:space="preserve">Modificación de los datos de los </w:t>
+      </w:r>
+      <w:proofErr w:type="spellStart"/>
+      <w:r>
+        <w:t>editText</w:t>
+      </w:r>
+      <w:proofErr w:type="spellEnd"/>
+      <w:r>
+        <w:t>.</w:t>
       </w:r>
       <w:r>
         <w:rPr>
@@ -1612,8 +2119,13 @@
           <w:numId w:val="3"/>
         </w:numPr>
       </w:pPr>
-      <w:r>
-        <w:t>DatePickers.</w:t>
+      <w:proofErr w:type="spellStart"/>
+      <w:r>
+        <w:t>DatePickers</w:t>
+      </w:r>
+      <w:proofErr w:type="spellEnd"/>
+      <w:r>
+        <w:t>.</w:t>
       </w:r>
       <w:r>
         <w:rPr>
@@ -1649,7 +2161,15 @@
         </w:numPr>
       </w:pPr>
       <w:r>
-        <w:t>Mostrar Spinner Usuarios.</w:t>
+        <w:t xml:space="preserve">Mostrar </w:t>
+      </w:r>
+      <w:proofErr w:type="spellStart"/>
+      <w:r>
+        <w:t>Spinner</w:t>
+      </w:r>
+      <w:proofErr w:type="spellEnd"/>
+      <w:r>
+        <w:t xml:space="preserve"> Usuarios.</w:t>
       </w:r>
       <w:r>
         <w:rPr>
@@ -1667,7 +2187,15 @@
         </w:numPr>
       </w:pPr>
       <w:r>
-        <w:t>Mostrar Spinner Elementos.</w:t>
+        <w:t xml:space="preserve">Mostrar </w:t>
+      </w:r>
+      <w:proofErr w:type="spellStart"/>
+      <w:r>
+        <w:t>Spinner</w:t>
+      </w:r>
+      <w:proofErr w:type="spellEnd"/>
+      <w:r>
+        <w:t xml:space="preserve"> Elementos.</w:t>
       </w:r>
       <w:r>
         <w:rPr>
@@ -1685,7 +2213,15 @@
         </w:numPr>
       </w:pPr>
       <w:r>
-        <w:t>Guardar Spinner Usuarios.</w:t>
+        <w:t xml:space="preserve">Guardar </w:t>
+      </w:r>
+      <w:proofErr w:type="spellStart"/>
+      <w:r>
+        <w:t>Spinner</w:t>
+      </w:r>
+      <w:proofErr w:type="spellEnd"/>
+      <w:r>
+        <w:t xml:space="preserve"> Usuarios.</w:t>
       </w:r>
       <w:r>
         <w:t xml:space="preserve"> </w:t>
@@ -1706,7 +2242,15 @@
         </w:numPr>
       </w:pPr>
       <w:r>
-        <w:t>Guardar Spinner Elementos.</w:t>
+        <w:t xml:space="preserve">Guardar </w:t>
+      </w:r>
+      <w:proofErr w:type="spellStart"/>
+      <w:r>
+        <w:t>Spinner</w:t>
+      </w:r>
+      <w:proofErr w:type="spellEnd"/>
+      <w:r>
+        <w:t xml:space="preserve"> Elementos.</w:t>
       </w:r>
       <w:r>
         <w:t xml:space="preserve"> </w:t>
@@ -1727,7 +2271,15 @@
         </w:numPr>
       </w:pPr>
       <w:r>
-        <w:t>Guardar un Prestamo.</w:t>
+        <w:t xml:space="preserve">Guardar un </w:t>
+      </w:r>
+      <w:proofErr w:type="spellStart"/>
+      <w:r>
+        <w:t>Prestamo</w:t>
+      </w:r>
+      <w:proofErr w:type="spellEnd"/>
+      <w:r>
+        <w:t>.</w:t>
       </w:r>
       <w:r>
         <w:t xml:space="preserve"> </w:t>
@@ -1753,12 +2305,14 @@
           <w:lang w:val="en-GB"/>
         </w:rPr>
       </w:pPr>
+      <w:proofErr w:type="spellStart"/>
       <w:r>
         <w:rPr>
           <w:lang w:val="en-GB"/>
         </w:rPr>
         <w:t>Incidencias</w:t>
       </w:r>
+      <w:proofErr w:type="spellEnd"/>
     </w:p>
     <w:p>
       <w:pPr>
@@ -1817,11 +2371,19 @@
           <w:lang w:val="en-GB"/>
         </w:rPr>
       </w:pPr>
-      <w:r>
-        <w:rPr>
-          <w:lang w:val="en-GB"/>
-        </w:rPr>
-        <w:t>Activity(Lista)</w:t>
+      <w:proofErr w:type="gramStart"/>
+      <w:r>
+        <w:rPr>
+          <w:lang w:val="en-GB"/>
+        </w:rPr>
+        <w:t>Activity(</w:t>
+      </w:r>
+      <w:proofErr w:type="gramEnd"/>
+      <w:r>
+        <w:rPr>
+          <w:lang w:val="en-GB"/>
+        </w:rPr>
+        <w:t>Lista)</w:t>
       </w:r>
     </w:p>
     <w:p>
@@ -1853,8 +2415,13 @@
           <w:numId w:val="1"/>
         </w:numPr>
       </w:pPr>
-      <w:r>
-        <w:t>Boton Añadir Nueva.</w:t>
+      <w:proofErr w:type="spellStart"/>
+      <w:r>
+        <w:t>Boton</w:t>
+      </w:r>
+      <w:proofErr w:type="spellEnd"/>
+      <w:r>
+        <w:t xml:space="preserve"> Añadir Nueva.</w:t>
       </w:r>
       <w:r>
         <w:t xml:space="preserve"> </w:t>
@@ -1881,11 +2448,16 @@
         <w:t>de la incidencia</w:t>
       </w:r>
       <w:r>
-        <w:t xml:space="preserve"> al Activity_Info_</w:t>
+        <w:t xml:space="preserve"> al </w:t>
+      </w:r>
+      <w:proofErr w:type="spellStart"/>
+      <w:r>
+        <w:t>Activity_Info_</w:t>
       </w:r>
       <w:r>
         <w:t>Incidencia</w:t>
       </w:r>
+      <w:proofErr w:type="spellEnd"/>
       <w:r>
         <w:t>.</w:t>
       </w:r>
@@ -1908,7 +2480,15 @@
         </w:numPr>
       </w:pPr>
       <w:r>
-        <w:t>Al pulsar en la lista que vaya a la Activity_Info_</w:t>
+        <w:t xml:space="preserve">Al pulsar en la lista que vaya a la </w:t>
+      </w:r>
+      <w:proofErr w:type="spellStart"/>
+      <w:r>
+        <w:t>Activity_Info</w:t>
+      </w:r>
+      <w:proofErr w:type="spellEnd"/>
+      <w:r>
+        <w:t>_</w:t>
       </w:r>
       <w:r>
         <w:t xml:space="preserve"> </w:t>
@@ -1933,11 +2513,41 @@
           <w:lang w:val="en-GB"/>
         </w:rPr>
       </w:pPr>
-      <w:r>
-        <w:rPr>
-          <w:lang w:val="en-GB"/>
-        </w:rPr>
-        <w:t>Activity_Info(Ficha)</w:t>
+      <w:proofErr w:type="spellStart"/>
+      <w:r>
+        <w:rPr>
+          <w:lang w:val="en-GB"/>
+        </w:rPr>
+        <w:t>Activity_</w:t>
+      </w:r>
+      <w:proofErr w:type="gramStart"/>
+      <w:r>
+        <w:rPr>
+          <w:lang w:val="en-GB"/>
+        </w:rPr>
+        <w:t>Info</w:t>
+      </w:r>
+      <w:proofErr w:type="spellEnd"/>
+      <w:r>
+        <w:rPr>
+          <w:lang w:val="en-GB"/>
+        </w:rPr>
+        <w:t>(</w:t>
+      </w:r>
+      <w:proofErr w:type="spellStart"/>
+      <w:proofErr w:type="gramEnd"/>
+      <w:r>
+        <w:rPr>
+          <w:lang w:val="en-GB"/>
+        </w:rPr>
+        <w:t>Ficha</w:t>
+      </w:r>
+      <w:proofErr w:type="spellEnd"/>
+      <w:r>
+        <w:rPr>
+          <w:lang w:val="en-GB"/>
+        </w:rPr>
+        <w:t>)</w:t>
       </w:r>
       <w:r>
         <w:rPr>
@@ -1955,7 +2565,15 @@
         </w:numPr>
       </w:pPr>
       <w:r>
-        <w:t>Modificación de los datos de los editText.</w:t>
+        <w:t xml:space="preserve">Modificación de los datos de los </w:t>
+      </w:r>
+      <w:proofErr w:type="spellStart"/>
+      <w:r>
+        <w:t>editText</w:t>
+      </w:r>
+      <w:proofErr w:type="spellEnd"/>
+      <w:r>
+        <w:t>.</w:t>
       </w:r>
       <w:r>
         <w:t xml:space="preserve"> </w:t>
@@ -2002,8 +2620,13 @@
           <w:numId w:val="3"/>
         </w:numPr>
       </w:pPr>
-      <w:r>
-        <w:t>DatePickers.</w:t>
+      <w:proofErr w:type="spellStart"/>
+      <w:r>
+        <w:t>DatePickers</w:t>
+      </w:r>
+      <w:proofErr w:type="spellEnd"/>
+      <w:r>
+        <w:t>.</w:t>
       </w:r>
       <w:r>
         <w:t xml:space="preserve"> </w:t>
@@ -2045,7 +2668,15 @@
         </w:numPr>
       </w:pPr>
       <w:r>
-        <w:t>Mostrar Spinner Usuario</w:t>
+        <w:t xml:space="preserve">Mostrar </w:t>
+      </w:r>
+      <w:proofErr w:type="spellStart"/>
+      <w:r>
+        <w:t>Spinner</w:t>
+      </w:r>
+      <w:proofErr w:type="spellEnd"/>
+      <w:r>
+        <w:t xml:space="preserve"> Usuario</w:t>
       </w:r>
       <w:r>
         <w:t>s de Creación</w:t>
@@ -2072,7 +2703,15 @@
         </w:numPr>
       </w:pPr>
       <w:r>
-        <w:t>Mostrar Spinner Elementos.</w:t>
+        <w:t xml:space="preserve">Mostrar </w:t>
+      </w:r>
+      <w:proofErr w:type="spellStart"/>
+      <w:r>
+        <w:t>Spinner</w:t>
+      </w:r>
+      <w:proofErr w:type="spellEnd"/>
+      <w:r>
+        <w:t xml:space="preserve"> Elementos.</w:t>
       </w:r>
       <w:r>
         <w:t xml:space="preserve"> </w:t>
@@ -2094,7 +2733,15 @@
       </w:pPr>
       <w:r>
         <w:lastRenderedPageBreak/>
-        <w:t>Guardar Spinner Usuarios</w:t>
+        <w:t xml:space="preserve">Guardar </w:t>
+      </w:r>
+      <w:proofErr w:type="spellStart"/>
+      <w:r>
+        <w:t>Spinner</w:t>
+      </w:r>
+      <w:proofErr w:type="spellEnd"/>
+      <w:r>
+        <w:t xml:space="preserve"> Usuarios</w:t>
       </w:r>
       <w:r>
         <w:t xml:space="preserve"> de Creación</w:t>
@@ -2121,7 +2768,15 @@
         </w:numPr>
       </w:pPr>
       <w:r>
-        <w:t>Guardar Spinner Elementos.</w:t>
+        <w:t xml:space="preserve">Guardar </w:t>
+      </w:r>
+      <w:proofErr w:type="spellStart"/>
+      <w:r>
+        <w:t>Spinner</w:t>
+      </w:r>
+      <w:proofErr w:type="spellEnd"/>
+      <w:r>
+        <w:t xml:space="preserve"> Elementos.</w:t>
       </w:r>
       <w:r>
         <w:t xml:space="preserve"> </w:t>
@@ -2171,7 +2826,15 @@
     </w:p>
     <w:p>
       <w:r>
-        <w:t>Falta hacer la funcionalidad de todos los searchviews.</w:t>
+        <w:t xml:space="preserve">Falta hacer la funcionalidad de todos los </w:t>
+      </w:r>
+      <w:proofErr w:type="spellStart"/>
+      <w:r>
+        <w:t>searchviews</w:t>
+      </w:r>
+      <w:proofErr w:type="spellEnd"/>
+      <w:r>
+        <w:t>.</w:t>
       </w:r>
     </w:p>
     <w:p>
@@ -2208,13 +2871,26 @@
     </w:p>
     <w:p>
       <w:r>
-        <w:t xml:space="preserve">Incidencia al buscar el nombre que he seleccionado en el Spinner me da </w:t>
-      </w:r>
+        <w:t xml:space="preserve">Incidencia al buscar el nombre que he seleccionado en el </w:t>
+      </w:r>
+      <w:proofErr w:type="spellStart"/>
+      <w:r>
+        <w:t>Spinner</w:t>
+      </w:r>
+      <w:proofErr w:type="spellEnd"/>
+      <w:r>
+        <w:t xml:space="preserve"> me da </w:t>
+      </w:r>
+      <w:proofErr w:type="spellStart"/>
       <w:r>
         <w:t>N</w:t>
       </w:r>
       <w:r>
-        <w:t xml:space="preserve">ullPointerException y no sé </w:t>
+        <w:t>ullPointerException</w:t>
+      </w:r>
+      <w:proofErr w:type="spellEnd"/>
+      <w:r>
+        <w:t xml:space="preserve"> y no sé </w:t>
       </w:r>
       <w:r>
         <w:t>por qué</w:t>
@@ -2225,7 +2901,15 @@
     </w:p>
     <w:p>
       <w:r>
-        <w:t>Ver las fechas en Info_Incidencia.</w:t>
+        <w:t xml:space="preserve">Ver las fechas en </w:t>
+      </w:r>
+      <w:proofErr w:type="spellStart"/>
+      <w:r>
+        <w:t>Info_Incidencia</w:t>
+      </w:r>
+      <w:proofErr w:type="spellEnd"/>
+      <w:r>
+        <w:t>.</w:t>
       </w:r>
     </w:p>
     <w:p/>

</xml_diff>